<commit_message>
Finalize R2 response letter with real 1d/5d results and honest discussion of the 5-day nominal-significance finding
</commit_message>
<xml_diff>
--- a/Manuscript/Major_Revision_02_/Response_to_Reviewers_R2.docx
+++ b/Manuscript/Major_Revision_02_/Response_to_Reviewers_R2.docx
@@ -306,7 +306,12 @@
     </w:p>
     <w:p>
       <w:r>
-        <w:t>[[HORIZON_RESULTS_PLACEHOLDER]]</w:t>
+        <w:t>- Results (256-row aligned sample, same regime-fixed threshold and same 8 High-VIX days as the 21-day analysis throughout): 1-day unconditioned accuracy 55.1% (AUC 0.527, majority 55.1%, McNemar p=1.000); High-VIX 62.5% vs Low-VIX 54.8% (Fisher p=0.734, not significant). 5-day unconditioned accuracy 56.6% (AUC 0.489, majority 56.6%, McNemar p=1.000); High-VIX 100.0% vs Low-VIX 55.2% (uncorrected Fisher p=0.011).</w:t>
+      </w:r>
+    </w:p>
+    <w:p>
+      <w:r>
+        <w:t>- We want to flag one honest complication rather than quietly resolve it: the 5-day result was not "no effect," as we originally expected and had drafted before running this analysis -- its uncorrected Fisher p (0.011) is in fact smaller than the 21-day headline result's dependence-aware p (1.000), and survives a naive Bonferroni correction across three horizons (p=0.032). We do not believe this supports a real 5-day effect: it rests on the same eight High-VIX days as every other horizon in this study, has not been subjected to the block-bootstrap / non-overlapping-resampling protocol used for 21-day, and is exactly the kind of small-sample coincidence the walk-forward analysis (R4, closing suggestion, below) warns against over-interpreting. We report it in Table 7 and Figure 3 rather than omit it, and we revised the paper's "horizon-specific" framing (Introduction, Section 7) to state plainly that the three horizons do not cleanly separate into "one real effect, two null effects" -- all three are better read as noisy draws from the same eight-day sample.</w:t>
       </w:r>
     </w:p>
     <w:p>

</xml_diff>